<commit_message>
fix: actualizar fechas lanzamiento 31 Mayo → 1 Julio 2026
Cronograma recalibrado por restricción de efectivo:
- Lanzamiento: 31 Mayo 2026 → 1 Julio 2026
- GATE 1: 7 Jun → 8 Jul (10 miembros pagos)
- GATE 2: 28 Jun → 29 Jul (50 miembros pagos)

79 reemplazos en 32 .docx + 9 archivos texto (md/html/json).

Co-Authored-By: Claude Opus 4.6 <noreply@anthropic.com>
</commit_message>
<xml_diff>
--- a/OPERACIONES/MANUALES DE OPERACION/01-EQUIPO-DIRECTIVO/GZ_Manual_CEO_V9_0.docx
+++ b/OPERACIONES/MANUALES DE OPERACION/01-EQUIPO-DIRECTIVO/GZ_Manual_CEO_V9_0.docx
@@ -4765,7 +4765,7 @@
         <w:pStyle w:val="ListParagraph"/>
       </w:pPr>
       <w:r>
-        <w:t>D1 — LLC Delaware. Stripe Atlas → EIN → Mercury → Wise → Stripe Connect. Launch 31 Mayo 2026.</w:t>
+        <w:t>D1 — LLC Delaware. Stripe Atlas → EIN → Mercury → Wise → Stripe Connect. Launch 1 Julio 2026.</w:t>
       </w:r>
     </w:p>
     <w:p>
@@ -4829,7 +4829,7 @@
         <w:pStyle w:val="ListParagraph"/>
       </w:pPr>
       <w:r>
-        <w:t>D9 — Lanzamiento 31 Mayo 2026. Snapshot Día 1 congela atribución.</w:t>
+        <w:t>D9 — Lanzamiento 1 Julio 2026. Snapshot Día 1 congela atribución.</w:t>
       </w:r>
     </w:p>
     <w:p>

</xml_diff>